<commit_message>
day 27 june 1
</commit_message>
<xml_diff>
--- a/June Daily Session.docx
+++ b/June Daily Session.docx
@@ -7,7 +7,13 @@
         <w:pStyle w:val="Heading1"/>
       </w:pPr>
       <w:r>
-        <w:t>Day 28 June 1</w:t>
+        <w:t>Day 2</w:t>
+      </w:r>
+      <w:r>
+        <w:t>7</w:t>
+      </w:r>
+      <w:r>
+        <w:t xml:space="preserve"> June 1</w:t>
       </w:r>
     </w:p>
     <w:p>

</xml_diff>

<commit_message>
commit june 10 SmartShop portal
</commit_message>
<xml_diff>
--- a/June Daily Session.docx
+++ b/June Daily Session.docx
@@ -587,7 +587,7 @@
           <w:noProof/>
           <w:color w:val="000000" w:themeColor="text1"/>
         </w:rPr>
-        <w:pict w14:anchorId="251B422C">
+        <w:pict w14:anchorId="795F0D22">
           <v:rect id="_x0000_i1042" alt="" style="width:468pt;height:.05pt;mso-width-percent:0;mso-height-percent:0;mso-width-percent:0;mso-height-percent:0" o:hralign="center" o:hrstd="t" o:hr="t" fillcolor="#a0a0a0" stroked="f"/>
         </w:pict>
       </w:r>
@@ -717,7 +717,7 @@
           <w:noProof/>
           <w:color w:val="000000" w:themeColor="text1"/>
         </w:rPr>
-        <w:pict w14:anchorId="2EF2DFC7">
+        <w:pict w14:anchorId="7036AD1F">
           <v:rect id="_x0000_i1041" alt="" style="width:468pt;height:.05pt;mso-width-percent:0;mso-height-percent:0;mso-width-percent:0;mso-height-percent:0" o:hralign="center" o:hrstd="t" o:hr="t" fillcolor="#a0a0a0" stroked="f"/>
         </w:pict>
       </w:r>
@@ -1084,7 +1084,7 @@
           <w:noProof/>
           <w:color w:val="000000" w:themeColor="text1"/>
         </w:rPr>
-        <w:pict w14:anchorId="253580AC">
+        <w:pict w14:anchorId="138BAB1B">
           <v:rect id="_x0000_i1040" alt="" style="width:468pt;height:.05pt;mso-width-percent:0;mso-height-percent:0;mso-width-percent:0;mso-height-percent:0" o:hralign="center" o:hrstd="t" o:hr="t" fillcolor="#a0a0a0" stroked="f"/>
         </w:pict>
       </w:r>
@@ -1253,7 +1253,7 @@
           <w:noProof/>
           <w:color w:val="000000" w:themeColor="text1"/>
         </w:rPr>
-        <w:pict w14:anchorId="2BA7FF32">
+        <w:pict w14:anchorId="1DF9A225">
           <v:rect id="_x0000_i1039" alt="" style="width:468pt;height:.05pt;mso-width-percent:0;mso-height-percent:0;mso-width-percent:0;mso-height-percent:0" o:hralign="center" o:hrstd="t" o:hr="t" fillcolor="#a0a0a0" stroked="f"/>
         </w:pict>
       </w:r>
@@ -1434,7 +1434,7 @@
           <w:noProof/>
           <w:color w:val="000000" w:themeColor="text1"/>
         </w:rPr>
-        <w:pict w14:anchorId="0906904E">
+        <w:pict w14:anchorId="05F99343">
           <v:rect id="_x0000_i1038" alt="" style="width:468pt;height:.05pt;mso-width-percent:0;mso-height-percent:0;mso-width-percent:0;mso-height-percent:0" o:hralign="center" o:hrstd="t" o:hr="t" fillcolor="#a0a0a0" stroked="f"/>
         </w:pict>
       </w:r>
@@ -1668,7 +1668,7 @@
           <w:noProof/>
           <w:color w:val="000000" w:themeColor="text1"/>
         </w:rPr>
-        <w:pict w14:anchorId="17678075">
+        <w:pict w14:anchorId="76EEE4D7">
           <v:rect id="_x0000_i1037" alt="" style="width:468pt;height:.05pt;mso-width-percent:0;mso-height-percent:0;mso-width-percent:0;mso-height-percent:0" o:hralign="center" o:hrstd="t" o:hr="t" fillcolor="#a0a0a0" stroked="f"/>
         </w:pict>
       </w:r>
@@ -1915,7 +1915,7 @@
           <w:noProof/>
           <w:color w:val="000000" w:themeColor="text1"/>
         </w:rPr>
-        <w:pict w14:anchorId="4B2E7A0D">
+        <w:pict w14:anchorId="038091C3">
           <v:rect id="_x0000_i1036" alt="" style="width:468pt;height:.05pt;mso-width-percent:0;mso-height-percent:0;mso-width-percent:0;mso-height-percent:0" o:hralign="center" o:hrstd="t" o:hr="t" fillcolor="#a0a0a0" stroked="f"/>
         </w:pict>
       </w:r>
@@ -2107,7 +2107,7 @@
           <w:noProof/>
           <w:color w:val="000000" w:themeColor="text1"/>
         </w:rPr>
-        <w:pict w14:anchorId="129CDC15">
+        <w:pict w14:anchorId="4AD5AB99">
           <v:rect id="_x0000_i1035" alt="" style="width:468pt;height:.05pt;mso-width-percent:0;mso-height-percent:0;mso-width-percent:0;mso-height-percent:0" o:hralign="center" o:hrstd="t" o:hr="t" fillcolor="#a0a0a0" stroked="f"/>
         </w:pict>
       </w:r>
@@ -2241,7 +2241,7 @@
           <w:noProof/>
           <w:color w:val="000000" w:themeColor="text1"/>
         </w:rPr>
-        <w:pict w14:anchorId="4FCBD2A4">
+        <w:pict w14:anchorId="073ED541">
           <v:rect id="_x0000_i1034" alt="" style="width:468pt;height:.05pt;mso-width-percent:0;mso-height-percent:0;mso-width-percent:0;mso-height-percent:0" o:hralign="center" o:hrstd="t" o:hr="t" fillcolor="#a0a0a0" stroked="f"/>
         </w:pict>
       </w:r>
@@ -2441,7 +2441,7 @@
           <w:noProof/>
           <w:color w:val="000000" w:themeColor="text1"/>
         </w:rPr>
-        <w:pict w14:anchorId="76E4333D">
+        <w:pict w14:anchorId="1C25E0C4">
           <v:rect id="_x0000_i1033" alt="" style="width:468pt;height:.05pt;mso-width-percent:0;mso-height-percent:0;mso-width-percent:0;mso-height-percent:0" o:hralign="center" o:hrstd="t" o:hr="t" fillcolor="#a0a0a0" stroked="f"/>
         </w:pict>
       </w:r>
@@ -2557,7 +2557,7 @@
           <w:noProof/>
           <w:color w:val="000000" w:themeColor="text1"/>
         </w:rPr>
-        <w:pict w14:anchorId="0E401E96">
+        <w:pict w14:anchorId="0AD43510">
           <v:rect id="_x0000_i1032" alt="" style="width:468pt;height:.05pt;mso-width-percent:0;mso-height-percent:0;mso-width-percent:0;mso-height-percent:0" o:hralign="center" o:hrstd="t" o:hr="t" fillcolor="#a0a0a0" stroked="f"/>
         </w:pict>
       </w:r>
@@ -2811,7 +2811,7 @@
           <w:noProof/>
           <w:color w:val="000000" w:themeColor="text1"/>
         </w:rPr>
-        <w:pict w14:anchorId="0A55236D">
+        <w:pict w14:anchorId="363F83D5">
           <v:rect id="_x0000_i1031" alt="" style="width:468pt;height:.05pt;mso-width-percent:0;mso-height-percent:0;mso-width-percent:0;mso-height-percent:0" o:hralign="center" o:hrstd="t" o:hr="t" fillcolor="#a0a0a0" stroked="f"/>
         </w:pict>
       </w:r>
@@ -2983,7 +2983,7 @@
           <w:noProof/>
           <w:color w:val="000000" w:themeColor="text1"/>
         </w:rPr>
-        <w:pict w14:anchorId="2A404269">
+        <w:pict w14:anchorId="7B967904">
           <v:rect id="_x0000_i1030" alt="" style="width:468pt;height:.05pt;mso-width-percent:0;mso-height-percent:0;mso-width-percent:0;mso-height-percent:0" o:hralign="center" o:hrstd="t" o:hr="t" fillcolor="#a0a0a0" stroked="f"/>
         </w:pict>
       </w:r>
@@ -3140,7 +3140,7 @@
           <w:noProof/>
           <w:color w:val="000000" w:themeColor="text1"/>
         </w:rPr>
-        <w:pict w14:anchorId="57F3B7C2">
+        <w:pict w14:anchorId="4F5ED7AA">
           <v:rect id="_x0000_i1029" alt="" style="width:468pt;height:.05pt;mso-width-percent:0;mso-height-percent:0;mso-width-percent:0;mso-height-percent:0" o:hralign="center" o:hrstd="t" o:hr="t" fillcolor="#a0a0a0" stroked="f"/>
         </w:pict>
       </w:r>
@@ -3324,7 +3324,7 @@
           <w:noProof/>
           <w:color w:val="000000" w:themeColor="text1"/>
         </w:rPr>
-        <w:pict w14:anchorId="5DE54581">
+        <w:pict w14:anchorId="41F41998">
           <v:rect id="_x0000_i1028" alt="" style="width:468pt;height:.05pt;mso-width-percent:0;mso-height-percent:0;mso-width-percent:0;mso-height-percent:0" o:hralign="center" o:hrstd="t" o:hr="t" fillcolor="#a0a0a0" stroked="f"/>
         </w:pict>
       </w:r>
@@ -3454,7 +3454,7 @@
           <w:noProof/>
           <w:color w:val="000000" w:themeColor="text1"/>
         </w:rPr>
-        <w:pict w14:anchorId="1ED27280">
+        <w:pict w14:anchorId="3E052EE7">
           <v:rect id="_x0000_i1027" alt="" style="width:468pt;height:.05pt;mso-width-percent:0;mso-height-percent:0;mso-width-percent:0;mso-height-percent:0" o:hralign="center" o:hrstd="t" o:hr="t" fillcolor="#a0a0a0" stroked="f"/>
         </w:pict>
       </w:r>
@@ -3553,7 +3553,7 @@
           <w:noProof/>
           <w:color w:val="000000" w:themeColor="text1"/>
         </w:rPr>
-        <w:pict w14:anchorId="0DCE2D30">
+        <w:pict w14:anchorId="45F7115B">
           <v:rect id="_x0000_i1026" alt="" style="width:468pt;height:.05pt;mso-width-percent:0;mso-height-percent:0;mso-width-percent:0;mso-height-percent:0" o:hralign="center" o:hrstd="t" o:hr="t" fillcolor="#a0a0a0" stroked="f"/>
         </w:pict>
       </w:r>
@@ -3841,7 +3841,7 @@
           <w:noProof/>
           <w:color w:val="000000" w:themeColor="text1"/>
         </w:rPr>
-        <w:pict w14:anchorId="4A2E8EC0">
+        <w:pict w14:anchorId="58EA854C">
           <v:rect id="_x0000_i1025" alt="" style="width:468pt;height:.05pt;mso-width-percent:0;mso-height-percent:0;mso-width-percent:0;mso-height-percent:0" o:hralign="center" o:hrstd="t" o:hr="t" fillcolor="#a0a0a0" stroked="f"/>
         </w:pict>
       </w:r>
@@ -4156,10 +4156,95 @@
         <w:t>Backend work is the main focus until Monday's evaluation.</w:t>
       </w:r>
     </w:p>
+    <w:p>
+      <w:pPr>
+        <w:pStyle w:val="NormalWeb"/>
+        <w:ind w:left="720"/>
+        <w:rPr>
+          <w:color w:val="000000" w:themeColor="text1"/>
+        </w:rPr>
+      </w:pPr>
+    </w:p>
+    <w:p>
+      <w:pPr>
+        <w:pStyle w:val="Heading1"/>
+      </w:pPr>
+      <w:r>
+        <w:lastRenderedPageBreak/>
+        <w:t>Day 31 June 8</w:t>
+      </w:r>
+    </w:p>
     <w:p/>
+    <w:p>
+      <w:r>
+        <w:t xml:space="preserve">so there are four major ways of communicating between components. </w:t>
+      </w:r>
+    </w:p>
+    <w:p>
+      <w:r>
+        <w:t xml:space="preserve">One we already saw, simple observable. </w:t>
+      </w:r>
+    </w:p>
+    <w:p>
+      <w:r>
+        <w:t xml:space="preserve">Second is parent-child relationship. </w:t>
+      </w:r>
+    </w:p>
+    <w:p>
+      <w:r>
+        <w:t xml:space="preserve">The third is the Redux store. </w:t>
+      </w:r>
+    </w:p>
+    <w:p>
+      <w:r>
+        <w:t>Fourth is the parameter for routing.</w:t>
+      </w:r>
+    </w:p>
+    <w:p>
+      <w:hyperlink r:id="rId11" w:history="1">
+        <w:r>
+          <w:rPr>
+            <w:rStyle w:val="Hyperlink"/>
+          </w:rPr>
+          <w:t>https://angular.dev/guide/forms/form-validation</w:t>
+        </w:r>
+      </w:hyperlink>
+    </w:p>
+    <w:p/>
+    <w:p>
+      <w:pPr>
+        <w:pStyle w:val="Heading1"/>
+      </w:pPr>
+      <w:r>
+        <w:t>Day 32 June 9</w:t>
+      </w:r>
+    </w:p>
+    <w:p>
+      <w:hyperlink r:id="rId12" w:history="1">
+        <w:r>
+          <w:rPr>
+            <w:rStyle w:val="Hyperlink"/>
+          </w:rPr>
+          <w:t>https://abhijayvuyyuru.substack.com/p/every-resource-you-need-to-pass-the</w:t>
+        </w:r>
+      </w:hyperlink>
+    </w:p>
+    <w:p>
+      <w:pPr>
+        <w:pStyle w:val="Heading1"/>
+      </w:pPr>
+      <w:r>
+        <w:t>Day 33 June 10</w:t>
+      </w:r>
+    </w:p>
+    <w:p>
+      <w:r>
+        <w:t>https://dummyjson.com/docs</w:t>
+      </w:r>
+    </w:p>
     <w:p/>
     <w:sectPr>
-      <w:headerReference w:type="default" r:id="rId11"/>
+      <w:headerReference w:type="default" r:id="rId13"/>
       <w:pgSz w:w="12240" w:h="15840"/>
       <w:pgMar w:top="1440" w:right="1440" w:bottom="1440" w:left="1440" w:header="720" w:footer="720" w:gutter="0"/>
       <w:cols w:space="720"/>

</xml_diff>

<commit_message>
Docker till June 17 Day 38
</commit_message>
<xml_diff>
--- a/June Daily Session.docx
+++ b/June Daily Session.docx
@@ -587,7 +587,7 @@
           <w:noProof/>
           <w:color w:val="000000" w:themeColor="text1"/>
         </w:rPr>
-        <w:pict w14:anchorId="01421D2C">
+        <w:pict w14:anchorId="7050F26F">
           <v:rect id="_x0000_i1062" alt="" style="width:468pt;height:.05pt;mso-width-percent:0;mso-height-percent:0;mso-width-percent:0;mso-height-percent:0" o:hralign="center" o:hrstd="t" o:hr="t" fillcolor="#a0a0a0" stroked="f"/>
         </w:pict>
       </w:r>
@@ -717,7 +717,7 @@
           <w:noProof/>
           <w:color w:val="000000" w:themeColor="text1"/>
         </w:rPr>
-        <w:pict w14:anchorId="4FB88A55">
+        <w:pict w14:anchorId="38F66414">
           <v:rect id="_x0000_i1061" alt="" style="width:468pt;height:.05pt;mso-width-percent:0;mso-height-percent:0;mso-width-percent:0;mso-height-percent:0" o:hralign="center" o:hrstd="t" o:hr="t" fillcolor="#a0a0a0" stroked="f"/>
         </w:pict>
       </w:r>
@@ -1084,7 +1084,7 @@
           <w:noProof/>
           <w:color w:val="000000" w:themeColor="text1"/>
         </w:rPr>
-        <w:pict w14:anchorId="0635E41D">
+        <w:pict w14:anchorId="3E230EE2">
           <v:rect id="_x0000_i1060" alt="" style="width:468pt;height:.05pt;mso-width-percent:0;mso-height-percent:0;mso-width-percent:0;mso-height-percent:0" o:hralign="center" o:hrstd="t" o:hr="t" fillcolor="#a0a0a0" stroked="f"/>
         </w:pict>
       </w:r>
@@ -1253,7 +1253,7 @@
           <w:noProof/>
           <w:color w:val="000000" w:themeColor="text1"/>
         </w:rPr>
-        <w:pict w14:anchorId="1D17CB66">
+        <w:pict w14:anchorId="0CF446DF">
           <v:rect id="_x0000_i1059" alt="" style="width:468pt;height:.05pt;mso-width-percent:0;mso-height-percent:0;mso-width-percent:0;mso-height-percent:0" o:hralign="center" o:hrstd="t" o:hr="t" fillcolor="#a0a0a0" stroked="f"/>
         </w:pict>
       </w:r>
@@ -1434,7 +1434,7 @@
           <w:noProof/>
           <w:color w:val="000000" w:themeColor="text1"/>
         </w:rPr>
-        <w:pict w14:anchorId="5FF9E990">
+        <w:pict w14:anchorId="7D19AD08">
           <v:rect id="_x0000_i1058" alt="" style="width:468pt;height:.05pt;mso-width-percent:0;mso-height-percent:0;mso-width-percent:0;mso-height-percent:0" o:hralign="center" o:hrstd="t" o:hr="t" fillcolor="#a0a0a0" stroked="f"/>
         </w:pict>
       </w:r>
@@ -1668,7 +1668,7 @@
           <w:noProof/>
           <w:color w:val="000000" w:themeColor="text1"/>
         </w:rPr>
-        <w:pict w14:anchorId="7D803F61">
+        <w:pict w14:anchorId="3F35D5CD">
           <v:rect id="_x0000_i1057" alt="" style="width:468pt;height:.05pt;mso-width-percent:0;mso-height-percent:0;mso-width-percent:0;mso-height-percent:0" o:hralign="center" o:hrstd="t" o:hr="t" fillcolor="#a0a0a0" stroked="f"/>
         </w:pict>
       </w:r>
@@ -1915,7 +1915,7 @@
           <w:noProof/>
           <w:color w:val="000000" w:themeColor="text1"/>
         </w:rPr>
-        <w:pict w14:anchorId="69855FA9">
+        <w:pict w14:anchorId="7B164A01">
           <v:rect id="_x0000_i1056" alt="" style="width:468pt;height:.05pt;mso-width-percent:0;mso-height-percent:0;mso-width-percent:0;mso-height-percent:0" o:hralign="center" o:hrstd="t" o:hr="t" fillcolor="#a0a0a0" stroked="f"/>
         </w:pict>
       </w:r>
@@ -2107,7 +2107,7 @@
           <w:noProof/>
           <w:color w:val="000000" w:themeColor="text1"/>
         </w:rPr>
-        <w:pict w14:anchorId="4B192424">
+        <w:pict w14:anchorId="13D2E64D">
           <v:rect id="_x0000_i1055" alt="" style="width:468pt;height:.05pt;mso-width-percent:0;mso-height-percent:0;mso-width-percent:0;mso-height-percent:0" o:hralign="center" o:hrstd="t" o:hr="t" fillcolor="#a0a0a0" stroked="f"/>
         </w:pict>
       </w:r>
@@ -2241,7 +2241,7 @@
           <w:noProof/>
           <w:color w:val="000000" w:themeColor="text1"/>
         </w:rPr>
-        <w:pict w14:anchorId="64D6CA89">
+        <w:pict w14:anchorId="6166D9A1">
           <v:rect id="_x0000_i1054" alt="" style="width:468pt;height:.05pt;mso-width-percent:0;mso-height-percent:0;mso-width-percent:0;mso-height-percent:0" o:hralign="center" o:hrstd="t" o:hr="t" fillcolor="#a0a0a0" stroked="f"/>
         </w:pict>
       </w:r>
@@ -2441,7 +2441,7 @@
           <w:noProof/>
           <w:color w:val="000000" w:themeColor="text1"/>
         </w:rPr>
-        <w:pict w14:anchorId="50E8256A">
+        <w:pict w14:anchorId="1791D273">
           <v:rect id="_x0000_i1053" alt="" style="width:468pt;height:.05pt;mso-width-percent:0;mso-height-percent:0;mso-width-percent:0;mso-height-percent:0" o:hralign="center" o:hrstd="t" o:hr="t" fillcolor="#a0a0a0" stroked="f"/>
         </w:pict>
       </w:r>
@@ -2557,7 +2557,7 @@
           <w:noProof/>
           <w:color w:val="000000" w:themeColor="text1"/>
         </w:rPr>
-        <w:pict w14:anchorId="3266252C">
+        <w:pict w14:anchorId="41C8C947">
           <v:rect id="_x0000_i1052" alt="" style="width:468pt;height:.05pt;mso-width-percent:0;mso-height-percent:0;mso-width-percent:0;mso-height-percent:0" o:hralign="center" o:hrstd="t" o:hr="t" fillcolor="#a0a0a0" stroked="f"/>
         </w:pict>
       </w:r>
@@ -2811,7 +2811,7 @@
           <w:noProof/>
           <w:color w:val="000000" w:themeColor="text1"/>
         </w:rPr>
-        <w:pict w14:anchorId="2EDC8B4A">
+        <w:pict w14:anchorId="6BCFDB0F">
           <v:rect id="_x0000_i1051" alt="" style="width:468pt;height:.05pt;mso-width-percent:0;mso-height-percent:0;mso-width-percent:0;mso-height-percent:0" o:hralign="center" o:hrstd="t" o:hr="t" fillcolor="#a0a0a0" stroked="f"/>
         </w:pict>
       </w:r>
@@ -2983,7 +2983,7 @@
           <w:noProof/>
           <w:color w:val="000000" w:themeColor="text1"/>
         </w:rPr>
-        <w:pict w14:anchorId="4F5D7B7D">
+        <w:pict w14:anchorId="5D1D691F">
           <v:rect id="_x0000_i1050" alt="" style="width:468pt;height:.05pt;mso-width-percent:0;mso-height-percent:0;mso-width-percent:0;mso-height-percent:0" o:hralign="center" o:hrstd="t" o:hr="t" fillcolor="#a0a0a0" stroked="f"/>
         </w:pict>
       </w:r>
@@ -3140,7 +3140,7 @@
           <w:noProof/>
           <w:color w:val="000000" w:themeColor="text1"/>
         </w:rPr>
-        <w:pict w14:anchorId="5CF0E3E5">
+        <w:pict w14:anchorId="45B5AD0F">
           <v:rect id="_x0000_i1049" alt="" style="width:468pt;height:.05pt;mso-width-percent:0;mso-height-percent:0;mso-width-percent:0;mso-height-percent:0" o:hralign="center" o:hrstd="t" o:hr="t" fillcolor="#a0a0a0" stroked="f"/>
         </w:pict>
       </w:r>
@@ -3324,7 +3324,7 @@
           <w:noProof/>
           <w:color w:val="000000" w:themeColor="text1"/>
         </w:rPr>
-        <w:pict w14:anchorId="0AAFA21C">
+        <w:pict w14:anchorId="5AEF20B1">
           <v:rect id="_x0000_i1048" alt="" style="width:468pt;height:.05pt;mso-width-percent:0;mso-height-percent:0;mso-width-percent:0;mso-height-percent:0" o:hralign="center" o:hrstd="t" o:hr="t" fillcolor="#a0a0a0" stroked="f"/>
         </w:pict>
       </w:r>
@@ -3454,7 +3454,7 @@
           <w:noProof/>
           <w:color w:val="000000" w:themeColor="text1"/>
         </w:rPr>
-        <w:pict w14:anchorId="0E5B59CF">
+        <w:pict w14:anchorId="49C7DE37">
           <v:rect id="_x0000_i1047" alt="" style="width:468pt;height:.05pt;mso-width-percent:0;mso-height-percent:0;mso-width-percent:0;mso-height-percent:0" o:hralign="center" o:hrstd="t" o:hr="t" fillcolor="#a0a0a0" stroked="f"/>
         </w:pict>
       </w:r>
@@ -3553,7 +3553,7 @@
           <w:noProof/>
           <w:color w:val="000000" w:themeColor="text1"/>
         </w:rPr>
-        <w:pict w14:anchorId="5532A865">
+        <w:pict w14:anchorId="1A7538EE">
           <v:rect id="_x0000_i1046" alt="" style="width:468pt;height:.05pt;mso-width-percent:0;mso-height-percent:0;mso-width-percent:0;mso-height-percent:0" o:hralign="center" o:hrstd="t" o:hr="t" fillcolor="#a0a0a0" stroked="f"/>
         </w:pict>
       </w:r>
@@ -3841,7 +3841,7 @@
           <w:noProof/>
           <w:color w:val="000000" w:themeColor="text1"/>
         </w:rPr>
-        <w:pict w14:anchorId="230CDBD2">
+        <w:pict w14:anchorId="664F1638">
           <v:rect id="_x0000_i1045" alt="" style="width:468pt;height:.05pt;mso-width-percent:0;mso-height-percent:0;mso-width-percent:0;mso-height-percent:0" o:hralign="center" o:hrstd="t" o:hr="t" fillcolor="#a0a0a0" stroked="f"/>
         </w:pict>
       </w:r>
@@ -5148,7 +5148,7 @@
           <w:noProof/>
           <w:color w:val="000000" w:themeColor="text1"/>
         </w:rPr>
-        <w:pict w14:anchorId="48768E3D">
+        <w:pict w14:anchorId="1990DBBD">
           <v:rect id="_x0000_i1044" alt="" style="width:468pt;height:.05pt;mso-width-percent:0;mso-height-percent:0;mso-width-percent:0;mso-height-percent:0" o:hralign="center" o:hrstd="t" o:hr="t" fillcolor="#a0a0a0" stroked="f"/>
         </w:pict>
       </w:r>
@@ -5386,7 +5386,7 @@
           <w:noProof/>
           <w:color w:val="000000" w:themeColor="text1"/>
         </w:rPr>
-        <w:pict w14:anchorId="595E17CD">
+        <w:pict w14:anchorId="03A25AC9">
           <v:rect id="_x0000_i1043" alt="" style="width:468pt;height:.05pt;mso-width-percent:0;mso-height-percent:0;mso-width-percent:0;mso-height-percent:0" o:hralign="center" o:hrstd="t" o:hr="t" fillcolor="#a0a0a0" stroked="f"/>
         </w:pict>
       </w:r>
@@ -5621,7 +5621,7 @@
           <w:noProof/>
           <w:color w:val="000000" w:themeColor="text1"/>
         </w:rPr>
-        <w:pict w14:anchorId="20292DE7">
+        <w:pict w14:anchorId="0DDF9190">
           <v:rect id="_x0000_i1042" alt="" style="width:468pt;height:.05pt;mso-width-percent:0;mso-height-percent:0;mso-width-percent:0;mso-height-percent:0" o:hralign="center" o:hrstd="t" o:hr="t" fillcolor="#a0a0a0" stroked="f"/>
         </w:pict>
       </w:r>
@@ -5762,7 +5762,7 @@
           <w:noProof/>
           <w:color w:val="000000" w:themeColor="text1"/>
         </w:rPr>
-        <w:pict w14:anchorId="6F05457F">
+        <w:pict w14:anchorId="4504739B">
           <v:rect id="_x0000_i1041" alt="" style="width:468pt;height:.05pt;mso-width-percent:0;mso-height-percent:0;mso-width-percent:0;mso-height-percent:0" o:hralign="center" o:hrstd="t" o:hr="t" fillcolor="#a0a0a0" stroked="f"/>
         </w:pict>
       </w:r>
@@ -6069,7 +6069,7 @@
           <w:color w:val="000000" w:themeColor="text1"/>
         </w:rPr>
         <w:lastRenderedPageBreak/>
-        <w:pict w14:anchorId="49C5133F">
+        <w:pict w14:anchorId="67E0C73F">
           <v:rect id="_x0000_i1040" alt="" style="width:468pt;height:.05pt;mso-width-percent:0;mso-height-percent:0;mso-width-percent:0;mso-height-percent:0" o:hralign="center" o:hrstd="t" o:hr="t" fillcolor="#a0a0a0" stroked="f"/>
         </w:pict>
       </w:r>
@@ -6390,7 +6390,7 @@
           <w:noProof/>
           <w:color w:val="000000" w:themeColor="text1"/>
         </w:rPr>
-        <w:pict w14:anchorId="06BB886D">
+        <w:pict w14:anchorId="7FD3C35D">
           <v:rect id="_x0000_i1039" alt="" style="width:468pt;height:.05pt;mso-width-percent:0;mso-height-percent:0;mso-width-percent:0;mso-height-percent:0" o:hralign="center" o:hrstd="t" o:hr="t" fillcolor="#a0a0a0" stroked="f"/>
         </w:pict>
       </w:r>
@@ -6839,7 +6839,7 @@
           <w:noProof/>
           <w:color w:val="000000" w:themeColor="text1"/>
         </w:rPr>
-        <w:pict w14:anchorId="65C4C65F">
+        <w:pict w14:anchorId="1E5C9D7B">
           <v:rect id="_x0000_i1038" alt="" style="width:468pt;height:.05pt;mso-width-percent:0;mso-height-percent:0;mso-width-percent:0;mso-height-percent:0" o:hralign="center" o:hrstd="t" o:hr="t" fillcolor="#a0a0a0" stroked="f"/>
         </w:pict>
       </w:r>
@@ -7089,7 +7089,7 @@
           <w:noProof/>
           <w:color w:val="000000" w:themeColor="text1"/>
         </w:rPr>
-        <w:pict w14:anchorId="5E1B4B84">
+        <w:pict w14:anchorId="38449987">
           <v:rect id="_x0000_i1037" alt="" style="width:468pt;height:.05pt;mso-width-percent:0;mso-height-percent:0;mso-width-percent:0;mso-height-percent:0" o:hralign="center" o:hrstd="t" o:hr="t" fillcolor="#a0a0a0" stroked="f"/>
         </w:pict>
       </w:r>
@@ -7274,7 +7274,7 @@
           <w:noProof/>
           <w:color w:val="000000" w:themeColor="text1"/>
         </w:rPr>
-        <w:pict w14:anchorId="7B43CE58">
+        <w:pict w14:anchorId="5D03BC88">
           <v:rect id="_x0000_i1036" alt="" style="width:468pt;height:.05pt;mso-width-percent:0;mso-height-percent:0;mso-width-percent:0;mso-height-percent:0" o:hralign="center" o:hrstd="t" o:hr="t" fillcolor="#a0a0a0" stroked="f"/>
         </w:pict>
       </w:r>
@@ -7388,7 +7388,7 @@
           <w:noProof/>
           <w:color w:val="000000" w:themeColor="text1"/>
         </w:rPr>
-        <w:pict w14:anchorId="1628D8B1">
+        <w:pict w14:anchorId="53D20955">
           <v:rect id="_x0000_i1035" alt="" style="width:468pt;height:.05pt;mso-width-percent:0;mso-height-percent:0;mso-width-percent:0;mso-height-percent:0" o:hralign="center" o:hrstd="t" o:hr="t" fillcolor="#a0a0a0" stroked="f"/>
         </w:pict>
       </w:r>
@@ -7667,7 +7667,7 @@
           <w:noProof/>
           <w:color w:val="000000" w:themeColor="text1"/>
         </w:rPr>
-        <w:pict w14:anchorId="5189935D">
+        <w:pict w14:anchorId="7A8669F0">
           <v:rect id="_x0000_i1034" alt="" style="width:468pt;height:.05pt;mso-width-percent:0;mso-height-percent:0;mso-width-percent:0;mso-height-percent:0" o:hralign="center" o:hrstd="t" o:hr="t" fillcolor="#a0a0a0" stroked="f"/>
         </w:pict>
       </w:r>
@@ -7929,7 +7929,7 @@
           <w:noProof/>
           <w:color w:val="000000" w:themeColor="text1"/>
         </w:rPr>
-        <w:pict w14:anchorId="0CC29215">
+        <w:pict w14:anchorId="3BD5FF41">
           <v:rect id="_x0000_i1033" alt="" style="width:468pt;height:.05pt;mso-width-percent:0;mso-height-percent:0;mso-width-percent:0;mso-height-percent:0" o:hralign="center" o:hrstd="t" o:hr="t" fillcolor="#a0a0a0" stroked="f"/>
         </w:pict>
       </w:r>
@@ -8130,7 +8130,7 @@
           <w:noProof/>
           <w:color w:val="000000" w:themeColor="text1"/>
         </w:rPr>
-        <w:pict w14:anchorId="26B109B0">
+        <w:pict w14:anchorId="0D07D59B">
           <v:rect id="_x0000_i1032" alt="" style="width:468pt;height:.05pt;mso-width-percent:0;mso-height-percent:0;mso-width-percent:0;mso-height-percent:0" o:hralign="center" o:hrstd="t" o:hr="t" fillcolor="#a0a0a0" stroked="f"/>
         </w:pict>
       </w:r>
@@ -8353,7 +8353,7 @@
           <w:noProof/>
           <w:color w:val="000000" w:themeColor="text1"/>
         </w:rPr>
-        <w:pict w14:anchorId="64A2EF24">
+        <w:pict w14:anchorId="7F916F9D">
           <v:rect id="_x0000_i1031" alt="" style="width:468pt;height:.05pt;mso-width-percent:0;mso-height-percent:0;mso-width-percent:0;mso-height-percent:0" o:hralign="center" o:hrstd="t" o:hr="t" fillcolor="#a0a0a0" stroked="f"/>
         </w:pict>
       </w:r>
@@ -8574,7 +8574,7 @@
           <w:noProof/>
           <w:color w:val="000000" w:themeColor="text1"/>
         </w:rPr>
-        <w:pict w14:anchorId="444728A9">
+        <w:pict w14:anchorId="56162867">
           <v:rect id="_x0000_i1030" alt="" style="width:468pt;height:.05pt;mso-width-percent:0;mso-height-percent:0;mso-width-percent:0;mso-height-percent:0" o:hralign="center" o:hrstd="t" o:hr="t" fillcolor="#a0a0a0" stroked="f"/>
         </w:pict>
       </w:r>
@@ -8712,7 +8712,7 @@
           <w:noProof/>
           <w:color w:val="000000" w:themeColor="text1"/>
         </w:rPr>
-        <w:pict w14:anchorId="66A8D206">
+        <w:pict w14:anchorId="37A0CC7E">
           <v:rect id="_x0000_i1029" alt="" style="width:468pt;height:.05pt;mso-width-percent:0;mso-height-percent:0;mso-width-percent:0;mso-height-percent:0" o:hralign="center" o:hrstd="t" o:hr="t" fillcolor="#a0a0a0" stroked="f"/>
         </w:pict>
       </w:r>
@@ -8872,7 +8872,7 @@
           <w:noProof/>
           <w:color w:val="000000" w:themeColor="text1"/>
         </w:rPr>
-        <w:pict w14:anchorId="1C14510B">
+        <w:pict w14:anchorId="4F506F93">
           <v:rect id="_x0000_i1028" alt="" style="width:468pt;height:.05pt;mso-width-percent:0;mso-height-percent:0;mso-width-percent:0;mso-height-percent:0" o:hralign="center" o:hrstd="t" o:hr="t" fillcolor="#a0a0a0" stroked="f"/>
         </w:pict>
       </w:r>
@@ -8970,7 +8970,7 @@
           <w:noProof/>
           <w:color w:val="000000" w:themeColor="text1"/>
         </w:rPr>
-        <w:pict w14:anchorId="09C00822">
+        <w:pict w14:anchorId="55B77046">
           <v:rect id="_x0000_i1027" alt="" style="width:468pt;height:.05pt;mso-width-percent:0;mso-height-percent:0;mso-width-percent:0;mso-height-percent:0" o:hralign="center" o:hrstd="t" o:hr="t" fillcolor="#a0a0a0" stroked="f"/>
         </w:pict>
       </w:r>
@@ -9073,7 +9073,7 @@
           <w:noProof/>
           <w:color w:val="000000" w:themeColor="text1"/>
         </w:rPr>
-        <w:pict w14:anchorId="506FEAB2">
+        <w:pict w14:anchorId="3809CE1E">
           <v:rect id="_x0000_i1026" alt="" style="width:468pt;height:.05pt;mso-width-percent:0;mso-height-percent:0;mso-width-percent:0;mso-height-percent:0" o:hralign="center" o:hrstd="t" o:hr="t" fillcolor="#a0a0a0" stroked="f"/>
         </w:pict>
       </w:r>
@@ -9179,7 +9179,7 @@
           <w:noProof/>
           <w:color w:val="000000" w:themeColor="text1"/>
         </w:rPr>
-        <w:pict w14:anchorId="559D8ADF">
+        <w:pict w14:anchorId="45EB0EB9">
           <v:rect id="_x0000_i1025" alt="" style="width:468pt;height:.05pt;mso-width-percent:0;mso-height-percent:0;mso-width-percent:0;mso-height-percent:0" o:hralign="center" o:hrstd="t" o:hr="t" fillcolor="#a0a0a0" stroked="f"/>
         </w:pict>
       </w:r>
@@ -9918,12 +9918,40 @@
         </w:r>
       </w:hyperlink>
     </w:p>
+    <w:p>
+      <w:pPr>
+        <w:pStyle w:val="Heading1"/>
+      </w:pPr>
+      <w:r>
+        <w:t>Day 38 June 17</w:t>
+      </w:r>
+    </w:p>
+    <w:p>
+      <w:pPr>
+        <w:pStyle w:val="Heading1"/>
+      </w:pPr>
+      <w:r>
+        <w:t>Day 39 June 18</w:t>
+      </w:r>
+    </w:p>
+    <w:p>
+      <w:hyperlink r:id="rId17" w:history="1">
+        <w:r>
+          <w:rPr>
+            <w:rStyle w:val="Hyperlink"/>
+          </w:rPr>
+          <w:t>https://yaml.org</w:t>
+        </w:r>
+      </w:hyperlink>
+    </w:p>
+    <w:p/>
+    <w:p/>
     <w:p/>
     <w:p/>
     <w:p/>
     <w:p/>
     <w:sectPr>
-      <w:headerReference w:type="default" r:id="rId17"/>
+      <w:headerReference w:type="default" r:id="rId18"/>
       <w:pgSz w:w="12240" w:h="15840"/>
       <w:pgMar w:top="1440" w:right="1440" w:bottom="1440" w:left="1440" w:header="720" w:footer="720" w:gutter="0"/>
       <w:cols w:space="720"/>

</xml_diff>